<commit_message>
created a combined t1 stratified by sex AND screen time quantile
</commit_message>
<xml_diff>
--- a/Code/Table1_Females.docx
+++ b/Code/Table1_Females.docx
@@ -81,7 +81,7 @@
                 <w:rFonts w:ascii="Calibri" w:hAnsi="Calibri"/>
                 <w:sz w:val="20"/>
               </w:rPr>
-              <w:t xml:space="preserve">TBLH BMD Z-score Quartile</w:t>
+              <w:t xml:space="preserve">Daily Screen Time Quartile</w:t>
             </w:r>
           </w:p>
         </w:tc>
@@ -3429,7 +3429,7 @@
                 <w:rFonts w:ascii="Calibri" w:hAnsi="Calibri"/>
                 <w:sz w:val="20"/>
               </w:rPr>
-              <w:t xml:space="default">Weighted percentages and unweighted sample counts shown. Abbreviations: NHANES, National Health and Nutrition Examination Survey; SE, Standard Error; PIR, Poverty Income Ratio; TBLH, Total Body Less Head; BMD, Bone Mineral Density.</w:t>
+              <w:t xml:space="default">Continuous variables are presented as weighted mean (SE) and categorical variables are presented as unweighted n (weighted %). Abbreviations: NHANES, National Health and Nutrition Examination Survey; SE, Standard Error; PIR, Poverty Income Ratio.</w:t>
             </w:r>
           </w:p>
         </w:tc>

</xml_diff>

<commit_message>
updated t1 w/ cat age var, mean/SE/% for each quartile
</commit_message>
<xml_diff>
--- a/Code/Table1_Females.docx
+++ b/Code/Table1_Females.docx
@@ -306,7 +306,7 @@
                 <w:rFonts w:ascii="Calibri" w:hAnsi="Calibri"/>
                 <w:sz w:val="20"/>
               </w:rPr>
-              <w:t xml:space="default">Age</w:t>
+              <w:t xml:space="default">Age (Years)</w:t>
             </w:r>
           </w:p>
         </w:tc>
@@ -3407,6 +3407,453 @@
                 <w:sz w:val="20"/>
               </w:rPr>
               <w:t xml:space="default">70 (17%)</w:t>
+            </w:r>
+          </w:p>
+        </w:tc>
+      </w:tr>
+      <w:tr>
+        <w:trPr>
+          <w:cantSplit/>
+        </w:trPr>
+        <w:tc>
+          <w:tcPr>
+            <w:tcBorders>
+              <w:top w:val="single" w:space="0" w:color="D3D3D3"/>
+              <w:bottom w:val="single" w:space="0" w:color="D3D3D3"/>
+              <w:start w:val="single" w:space="0" w:color="D3D3D3"/>
+              <w:end w:val="single" w:space="0" w:color="D3D3D3"/>
+            </w:tcBorders>
+          </w:tcPr>
+          <w:p>
+            <w:pPr>
+              <w:spacing w:before="0" w:after="60"/>
+              <w:keepNext/>
+              <w:jc w:val="start"/>
+            </w:pPr>
+            <w:r>
+              <w:rPr>
+                <w:rFonts w:ascii="Calibri" w:hAnsi="Calibri"/>
+                <w:sz w:val="20"/>
+              </w:rPr>
+              <w:t xml:space="default">Age Group</w:t>
+            </w:r>
+          </w:p>
+        </w:tc>
+        <w:tc>
+          <w:tcPr>
+            <w:tcBorders>
+              <w:top w:val="single" w:space="0" w:color="D3D3D3"/>
+              <w:bottom w:val="single" w:space="0" w:color="D3D3D3"/>
+              <w:start w:val="single" w:space="0" w:color="D3D3D3"/>
+              <w:end w:val="single" w:space="0" w:color="D3D3D3"/>
+            </w:tcBorders>
+          </w:tcPr>
+          <w:p>
+            <w:pPr>
+              <w:spacing w:before="0" w:after="60"/>
+              <w:keepNext/>
+              <w:jc w:val="center"/>
+            </w:pPr>
+            <w:r>
+              <w:rPr>
+                <w:rFonts w:ascii="Calibri" w:hAnsi="Calibri"/>
+                <w:sz w:val="20"/>
+              </w:rPr>
+              <w:t xml:space="default">0 (0)</w:t>
+            </w:r>
+          </w:p>
+        </w:tc>
+        <w:tc>
+          <w:tcPr>
+            <w:tcBorders>
+              <w:top w:val="single" w:space="0" w:color="D3D3D3"/>
+              <w:bottom w:val="single" w:space="0" w:color="D3D3D3"/>
+              <w:start w:val="single" w:space="0" w:color="D3D3D3"/>
+              <w:end w:val="single" w:space="0" w:color="D3D3D3"/>
+            </w:tcBorders>
+          </w:tcPr>
+          <w:p>
+            <w:pPr>
+              <w:spacing w:before="0" w:after="60"/>
+              <w:keepNext/>
+              <w:jc w:val="center"/>
+            </w:pPr>
+            <w:r>
+              <w:rPr>
+                <w:rFonts w:ascii="Calibri" w:hAnsi="Calibri"/>
+                <w:sz w:val="20"/>
+              </w:rPr>
+              <w:t xml:space="default"/>
+            </w:r>
+          </w:p>
+        </w:tc>
+        <w:tc>
+          <w:tcPr>
+            <w:tcBorders>
+              <w:top w:val="single" w:space="0" w:color="D3D3D3"/>
+              <w:bottom w:val="single" w:space="0" w:color="D3D3D3"/>
+              <w:start w:val="single" w:space="0" w:color="D3D3D3"/>
+              <w:end w:val="single" w:space="0" w:color="D3D3D3"/>
+            </w:tcBorders>
+          </w:tcPr>
+          <w:p>
+            <w:pPr>
+              <w:spacing w:before="0" w:after="60"/>
+              <w:keepNext/>
+              <w:jc w:val="center"/>
+            </w:pPr>
+            <w:r>
+              <w:rPr>
+                <w:rFonts w:ascii="Calibri" w:hAnsi="Calibri"/>
+                <w:sz w:val="20"/>
+              </w:rPr>
+              <w:t xml:space="default"/>
+            </w:r>
+          </w:p>
+        </w:tc>
+        <w:tc>
+          <w:tcPr>
+            <w:tcBorders>
+              <w:top w:val="single" w:space="0" w:color="D3D3D3"/>
+              <w:bottom w:val="single" w:space="0" w:color="D3D3D3"/>
+              <w:start w:val="single" w:space="0" w:color="D3D3D3"/>
+              <w:end w:val="single" w:space="0" w:color="D3D3D3"/>
+            </w:tcBorders>
+          </w:tcPr>
+          <w:p>
+            <w:pPr>
+              <w:spacing w:before="0" w:after="60"/>
+              <w:keepNext/>
+              <w:jc w:val="center"/>
+            </w:pPr>
+            <w:r>
+              <w:rPr>
+                <w:rFonts w:ascii="Calibri" w:hAnsi="Calibri"/>
+                <w:sz w:val="20"/>
+              </w:rPr>
+              <w:t xml:space="default"/>
+            </w:r>
+          </w:p>
+        </w:tc>
+        <w:tc>
+          <w:tcPr>
+            <w:tcBorders>
+              <w:top w:val="single" w:space="0" w:color="D3D3D3"/>
+              <w:bottom w:val="single" w:space="0" w:color="D3D3D3"/>
+              <w:start w:val="single" w:space="0" w:color="D3D3D3"/>
+              <w:end w:val="single" w:space="0" w:color="D3D3D3"/>
+            </w:tcBorders>
+          </w:tcPr>
+          <w:p>
+            <w:pPr>
+              <w:spacing w:before="0" w:after="60"/>
+              <w:keepNext/>
+              <w:jc w:val="center"/>
+            </w:pPr>
+            <w:r>
+              <w:rPr>
+                <w:rFonts w:ascii="Calibri" w:hAnsi="Calibri"/>
+                <w:sz w:val="20"/>
+              </w:rPr>
+              <w:t xml:space="default"/>
+            </w:r>
+          </w:p>
+        </w:tc>
+      </w:tr>
+      <w:tr>
+        <w:trPr>
+          <w:cantSplit/>
+        </w:trPr>
+        <w:tc>
+          <w:tcPr>
+            <w:tcBorders>
+              <w:top w:val="single" w:space="0" w:color="D3D3D3"/>
+              <w:bottom w:val="single" w:space="0" w:color="D3D3D3"/>
+              <w:start w:val="single" w:space="0" w:color="D3D3D3"/>
+              <w:end w:val="single" w:space="0" w:color="D3D3D3"/>
+            </w:tcBorders>
+          </w:tcPr>
+          <w:p>
+            <w:pPr>
+              <w:spacing w:before="0" w:after="60"/>
+              <w:keepNext/>
+              <w:jc w:val="start"/>
+            </w:pPr>
+            <w:r>
+              <w:rPr>
+                <w:rFonts w:ascii="Calibri" w:hAnsi="Calibri"/>
+                <w:sz w:val="20"/>
+              </w:rPr>
+              <w:t xml:space="default">    8–12 years</w:t>
+            </w:r>
+          </w:p>
+        </w:tc>
+        <w:tc>
+          <w:tcPr>
+            <w:tcBorders>
+              <w:top w:val="single" w:space="0" w:color="D3D3D3"/>
+              <w:bottom w:val="single" w:space="0" w:color="D3D3D3"/>
+              <w:start w:val="single" w:space="0" w:color="D3D3D3"/>
+              <w:end w:val="single" w:space="0" w:color="D3D3D3"/>
+            </w:tcBorders>
+          </w:tcPr>
+          <w:p>
+            <w:pPr>
+              <w:spacing w:before="0" w:after="60"/>
+              <w:keepNext/>
+              <w:jc w:val="center"/>
+            </w:pPr>
+            <w:r>
+              <w:rPr>
+                <w:rFonts w:ascii="Calibri" w:hAnsi="Calibri"/>
+                <w:sz w:val="20"/>
+              </w:rPr>
+              <w:t xml:space="default"/>
+            </w:r>
+          </w:p>
+        </w:tc>
+        <w:tc>
+          <w:tcPr>
+            <w:tcBorders>
+              <w:top w:val="single" w:space="0" w:color="D3D3D3"/>
+              <w:bottom w:val="single" w:space="0" w:color="D3D3D3"/>
+              <w:start w:val="single" w:space="0" w:color="D3D3D3"/>
+              <w:end w:val="single" w:space="0" w:color="D3D3D3"/>
+            </w:tcBorders>
+          </w:tcPr>
+          <w:p>
+            <w:pPr>
+              <w:spacing w:before="0" w:after="60"/>
+              <w:keepNext/>
+              <w:jc w:val="center"/>
+            </w:pPr>
+            <w:r>
+              <w:rPr>
+                <w:rFonts w:ascii="Calibri" w:hAnsi="Calibri"/>
+                <w:sz w:val="20"/>
+              </w:rPr>
+              <w:t xml:space="default">350 (64%)</w:t>
+            </w:r>
+          </w:p>
+        </w:tc>
+        <w:tc>
+          <w:tcPr>
+            <w:tcBorders>
+              <w:top w:val="single" w:space="0" w:color="D3D3D3"/>
+              <w:bottom w:val="single" w:space="0" w:color="D3D3D3"/>
+              <w:start w:val="single" w:space="0" w:color="D3D3D3"/>
+              <w:end w:val="single" w:space="0" w:color="D3D3D3"/>
+            </w:tcBorders>
+          </w:tcPr>
+          <w:p>
+            <w:pPr>
+              <w:spacing w:before="0" w:after="60"/>
+              <w:keepNext/>
+              <w:jc w:val="center"/>
+            </w:pPr>
+            <w:r>
+              <w:rPr>
+                <w:rFonts w:ascii="Calibri" w:hAnsi="Calibri"/>
+                <w:sz w:val="20"/>
+              </w:rPr>
+              <w:t xml:space="default">296 (57%)</w:t>
+            </w:r>
+          </w:p>
+        </w:tc>
+        <w:tc>
+          <w:tcPr>
+            <w:tcBorders>
+              <w:top w:val="single" w:space="0" w:color="D3D3D3"/>
+              <w:bottom w:val="single" w:space="0" w:color="D3D3D3"/>
+              <w:start w:val="single" w:space="0" w:color="D3D3D3"/>
+              <w:end w:val="single" w:space="0" w:color="D3D3D3"/>
+            </w:tcBorders>
+          </w:tcPr>
+          <w:p>
+            <w:pPr>
+              <w:spacing w:before="0" w:after="60"/>
+              <w:keepNext/>
+              <w:jc w:val="center"/>
+            </w:pPr>
+            <w:r>
+              <w:rPr>
+                <w:rFonts w:ascii="Calibri" w:hAnsi="Calibri"/>
+                <w:sz w:val="20"/>
+              </w:rPr>
+              <w:t xml:space="default">287 (41%)</w:t>
+            </w:r>
+          </w:p>
+        </w:tc>
+        <w:tc>
+          <w:tcPr>
+            <w:tcBorders>
+              <w:top w:val="single" w:space="0" w:color="D3D3D3"/>
+              <w:bottom w:val="single" w:space="0" w:color="D3D3D3"/>
+              <w:start w:val="single" w:space="0" w:color="D3D3D3"/>
+              <w:end w:val="single" w:space="0" w:color="D3D3D3"/>
+            </w:tcBorders>
+          </w:tcPr>
+          <w:p>
+            <w:pPr>
+              <w:spacing w:before="0" w:after="60"/>
+              <w:keepNext/>
+              <w:jc w:val="center"/>
+            </w:pPr>
+            <w:r>
+              <w:rPr>
+                <w:rFonts w:ascii="Calibri" w:hAnsi="Calibri"/>
+                <w:sz w:val="20"/>
+              </w:rPr>
+              <w:t xml:space="default">175 (37%)</w:t>
+            </w:r>
+          </w:p>
+        </w:tc>
+      </w:tr>
+      <w:tr>
+        <w:trPr>
+          <w:cantSplit/>
+        </w:trPr>
+        <w:tc>
+          <w:tcPr>
+            <w:tcBorders>
+              <w:top w:val="single" w:space="0" w:color="D3D3D3"/>
+              <w:bottom w:val="single" w:space="0" w:color="D3D3D3"/>
+              <w:start w:val="single" w:space="0" w:color="D3D3D3"/>
+              <w:end w:val="single" w:space="0" w:color="D3D3D3"/>
+            </w:tcBorders>
+          </w:tcPr>
+          <w:p>
+            <w:pPr>
+              <w:spacing w:before="0" w:after="60"/>
+              <w:keepNext/>
+              <w:jc w:val="start"/>
+            </w:pPr>
+            <w:r>
+              <w:rPr>
+                <w:rFonts w:ascii="Calibri" w:hAnsi="Calibri"/>
+                <w:sz w:val="20"/>
+              </w:rPr>
+              <w:t xml:space="default">    12–17 years</w:t>
+            </w:r>
+          </w:p>
+        </w:tc>
+        <w:tc>
+          <w:tcPr>
+            <w:tcBorders>
+              <w:top w:val="single" w:space="0" w:color="D3D3D3"/>
+              <w:bottom w:val="single" w:space="0" w:color="D3D3D3"/>
+              <w:start w:val="single" w:space="0" w:color="D3D3D3"/>
+              <w:end w:val="single" w:space="0" w:color="D3D3D3"/>
+            </w:tcBorders>
+          </w:tcPr>
+          <w:p>
+            <w:pPr>
+              <w:spacing w:before="0" w:after="60"/>
+              <w:keepNext/>
+              <w:jc w:val="center"/>
+            </w:pPr>
+            <w:r>
+              <w:rPr>
+                <w:rFonts w:ascii="Calibri" w:hAnsi="Calibri"/>
+                <w:sz w:val="20"/>
+              </w:rPr>
+              <w:t xml:space="default"/>
+            </w:r>
+          </w:p>
+        </w:tc>
+        <w:tc>
+          <w:tcPr>
+            <w:tcBorders>
+              <w:top w:val="single" w:space="0" w:color="D3D3D3"/>
+              <w:bottom w:val="single" w:space="0" w:color="D3D3D3"/>
+              <w:start w:val="single" w:space="0" w:color="D3D3D3"/>
+              <w:end w:val="single" w:space="0" w:color="D3D3D3"/>
+            </w:tcBorders>
+          </w:tcPr>
+          <w:p>
+            <w:pPr>
+              <w:spacing w:before="0" w:after="60"/>
+              <w:keepNext/>
+              <w:jc w:val="center"/>
+            </w:pPr>
+            <w:r>
+              <w:rPr>
+                <w:rFonts w:ascii="Calibri" w:hAnsi="Calibri"/>
+                <w:sz w:val="20"/>
+              </w:rPr>
+              <w:t xml:space="default">161 (36%)</w:t>
+            </w:r>
+          </w:p>
+        </w:tc>
+        <w:tc>
+          <w:tcPr>
+            <w:tcBorders>
+              <w:top w:val="single" w:space="0" w:color="D3D3D3"/>
+              <w:bottom w:val="single" w:space="0" w:color="D3D3D3"/>
+              <w:start w:val="single" w:space="0" w:color="D3D3D3"/>
+              <w:end w:val="single" w:space="0" w:color="D3D3D3"/>
+            </w:tcBorders>
+          </w:tcPr>
+          <w:p>
+            <w:pPr>
+              <w:spacing w:before="0" w:after="60"/>
+              <w:keepNext/>
+              <w:jc w:val="center"/>
+            </w:pPr>
+            <w:r>
+              <w:rPr>
+                <w:rFonts w:ascii="Calibri" w:hAnsi="Calibri"/>
+                <w:sz w:val="20"/>
+              </w:rPr>
+              <w:t xml:space="default">161 (43%)</w:t>
+            </w:r>
+          </w:p>
+        </w:tc>
+        <w:tc>
+          <w:tcPr>
+            <w:tcBorders>
+              <w:top w:val="single" w:space="0" w:color="D3D3D3"/>
+              <w:bottom w:val="single" w:space="0" w:color="D3D3D3"/>
+              <w:start w:val="single" w:space="0" w:color="D3D3D3"/>
+              <w:end w:val="single" w:space="0" w:color="D3D3D3"/>
+            </w:tcBorders>
+          </w:tcPr>
+          <w:p>
+            <w:pPr>
+              <w:spacing w:before="0" w:after="60"/>
+              <w:keepNext/>
+              <w:jc w:val="center"/>
+            </w:pPr>
+            <w:r>
+              <w:rPr>
+                <w:rFonts w:ascii="Calibri" w:hAnsi="Calibri"/>
+                <w:sz w:val="20"/>
+              </w:rPr>
+              <w:t xml:space="default">290 (59%)</w:t>
+            </w:r>
+          </w:p>
+        </w:tc>
+        <w:tc>
+          <w:tcPr>
+            <w:tcBorders>
+              <w:top w:val="single" w:space="0" w:color="D3D3D3"/>
+              <w:bottom w:val="single" w:space="0" w:color="D3D3D3"/>
+              <w:start w:val="single" w:space="0" w:color="D3D3D3"/>
+              <w:end w:val="single" w:space="0" w:color="D3D3D3"/>
+            </w:tcBorders>
+          </w:tcPr>
+          <w:p>
+            <w:pPr>
+              <w:spacing w:before="0" w:after="60"/>
+              <w:keepNext/>
+              <w:jc w:val="center"/>
+            </w:pPr>
+            <w:r>
+              <w:rPr>
+                <w:rFonts w:ascii="Calibri" w:hAnsi="Calibri"/>
+                <w:sz w:val="20"/>
+              </w:rPr>
+              <w:t xml:space="default">233 (63%)</w:t>
             </w:r>
           </w:p>
         </w:tc>

</xml_diff>